<commit_message>
docs(bd): clarify LMFM roster IS the VCH list (shared service, tri-logo)
Pre-empts the "did I email the wrong authority?" question: the
professional_Engineers_List.pdf is co-branded Fraser Health + PHSA + VCH;
FMP@fraserhealth.ca / fraserhealth.bonfirehub.ca is the shared LMFM desk
hosted by Fraser Health on behalf of all four authorities incl. VCH. No
separate VCH-only engineering prequalification exists.

Co-Authored-By: Claude Opus 4.8 (1M context) <noreply@anthropic.com>
</commit_message>
<xml_diff>
--- a/docs/KOR-VCH-Prequalification-Briefing-2026-06-24.docx
+++ b/docs/KOR-VCH-Prequalification-Briefing-2026-06-24.docx
@@ -352,7 +352,6 @@
               <w:rPr>
                 <w:sz w:val="19"/>
               </w:rPr>
-              <w:lastRenderedPageBreak/>
               <w:t>2</w:t>
             </w:r>
           </w:p>
@@ -516,6 +515,7 @@
               <w:rPr>
                 <w:sz w:val="19"/>
               </w:rPr>
+              <w:lastRenderedPageBreak/>
               <w:t>4</w:t>
             </w:r>
           </w:p>
@@ -698,6 +698,128 @@
     </w:p>
     <w:p>
       <w:pPr>
+        <w:pStyle w:val="BlockText"/>
+        <w:pBdr>
+          <w:top w:val="single" w:sz="8" w:space="1" w:color="1F3B5F"/>
+          <w:left w:val="single" w:sz="8" w:space="4" w:color="1F3B5F"/>
+          <w:bottom w:val="single" w:sz="8" w:space="1" w:color="1F3B5F"/>
+          <w:right w:val="single" w:sz="8" w:space="4" w:color="1F3B5F"/>
+        </w:pBdr>
+        <w:shd w:val="clear" w:color="auto" w:fill="E2EBF6"/>
+        <w:spacing w:before="120" w:after="120"/>
+        <w:ind w:left="200" w:right="200"/>
+      </w:pPr>
+      <w:r>
+        <w:rPr>
+          <w:b/>
+          <w:bCs/>
+        </w:rPr>
+        <w:t xml:space="preserve">This LMFM roster </w:t>
+      </w:r>
+      <w:r>
+        <w:rPr>
+          <w:b/>
+          <w:bCs/>
+          <w:i/>
+          <w:iCs/>
+        </w:rPr>
+        <w:t>is</w:t>
+      </w:r>
+      <w:r>
+        <w:rPr>
+          <w:b/>
+          <w:bCs/>
+        </w:rPr>
+        <w:t xml:space="preserve"> the VCH list — there is no separate “Vancouver Coastal Health” engineering prequalification.</w:t>
+      </w:r>
+      <w:r>
+        <w:t xml:space="preserve"> The four Lower Mainland health authorities (Fraser Health, PHSA, Providence and </w:t>
+      </w:r>
+      <w:r>
+        <w:rPr>
+          <w:b/>
+          <w:bCs/>
+        </w:rPr>
+        <w:t>VCH</w:t>
+      </w:r>
+      <w:r>
+        <w:t xml:space="preserve">) consolidated facilities procurement into one shared service, Lower Mainland Facilities Management (LMFM). The live </w:t>
+      </w:r>
+      <w:r>
+        <w:rPr>
+          <w:rStyle w:val="VerbatimChar"/>
+        </w:rPr>
+        <w:t>professional_Engineers_List.pdf</w:t>
+      </w:r>
+      <w:r>
+        <w:t xml:space="preserve"> carries </w:t>
+      </w:r>
+      <w:r>
+        <w:rPr>
+          <w:b/>
+          <w:bCs/>
+        </w:rPr>
+        <w:t>three logos on its masthead — Fraser Health, PHSA, and Vancouver Coastal Health</w:t>
+      </w:r>
+      <w:r>
+        <w:t xml:space="preserve"> — so VCH is on the roster’s own header. The list and the </w:t>
+      </w:r>
+      <w:r>
+        <w:rPr>
+          <w:rStyle w:val="VerbatimChar"/>
+        </w:rPr>
+        <w:t>FMP@fraserhealth.ca</w:t>
+      </w:r>
+      <w:r>
+        <w:t xml:space="preserve"> mailbox live on the</w:t>
+      </w:r>
+      <w:r>
+        <w:t xml:space="preserve"> </w:t>
+      </w:r>
+      <w:r>
+        <w:rPr>
+          <w:rStyle w:val="VerbatimChar"/>
+        </w:rPr>
+        <w:t>fraserhealth.ca</w:t>
+      </w:r>
+      <w:r>
+        <w:t xml:space="preserve"> domain only because Fraser Health is the administrative </w:t>
+      </w:r>
+      <w:r>
+        <w:rPr>
+          <w:i/>
+          <w:iCs/>
+        </w:rPr>
+        <w:t>host</w:t>
+      </w:r>
+      <w:r>
+        <w:t xml:space="preserve"> of the shared desk (</w:t>
+      </w:r>
+      <w:r>
+        <w:rPr>
+          <w:rStyle w:val="VerbatimChar"/>
+        </w:rPr>
+        <w:t>FMP</w:t>
+      </w:r>
+      <w:r>
+        <w:t xml:space="preserve"> </w:t>
+      </w:r>
+      <w:r>
+        <w:t xml:space="preserve">= Facilities Management Procurement, the LMFM desk), not because it is Fraser-Health-only. Being on this list makes KOR eligible for VCH’s non-acute / small-mid engineering work. (The only adjacent roster is a separate PHSA Supply Chain </w:t>
+      </w:r>
+      <w:r>
+        <w:rPr>
+          <w:i/>
+          <w:iCs/>
+        </w:rPr>
+        <w:t>generic consulting</w:t>
+      </w:r>
+      <w:r>
+        <w:t xml:space="preserve"> list — also shared across all four, not a VCH-specific structural list.)</w:t>
+      </w:r>
+    </w:p>
+    <w:p>
+      <w:pPr>
         <w:pStyle w:val="Compact"/>
         <w:numPr>
           <w:ilvl w:val="0"/>
@@ -712,11 +834,7 @@
         <w:t>Owner of the mechanism:</w:t>
       </w:r>
       <w:r>
-        <w:t xml:space="preserve"> Lower Mainland Facilities Management (LMFM) / the Facilities Management Procurement (FMP) division — shared procurement acting </w:t>
-      </w:r>
-      <w:r>
-        <w:lastRenderedPageBreak/>
-        <w:t>on behalf of Fraser Health, PHSA, Providence Health Care and Vancouver Coastal Health. Contact FMP@fraserhealth.ca.</w:t>
+        <w:t xml:space="preserve"> Lower Mainland Facilities Management (LMFM) / the Facilities Management Procurement (FMP) division — shared procurement acting on behalf of Fraser Health, PHSA, Providence Health Care and Vancouver Coastal Health. Contact FMP@fraserhealth.ca.</w:t>
       </w:r>
     </w:p>
     <w:p>
@@ -794,10 +912,8 @@
       <w:bookmarkStart w:id="4" w:name="Xd74c456c1e825b68b91998ad63fc2d35c2225ce"/>
       <w:bookmarkEnd w:id="3"/>
       <w:r>
-        <w:t xml:space="preserve">2. Where to register — the </w:t>
-      </w:r>
-      <w:r>
-        <w:t>“anything other than what we’re doing” answer</w:t>
+        <w:lastRenderedPageBreak/>
+        <w:t>2. Where to register — the “anything other than what we’re doing” answer</w:t>
       </w:r>
     </w:p>
     <w:p>
@@ -825,10 +941,7 @@
         <w:t>invited</w:t>
       </w:r>
       <w:r>
-        <w:t xml:space="preserve"> </w:t>
-      </w:r>
-      <w:r>
-        <w:t>to formal/larger non-alliance work requires being on the roster, applied for separately:</w:t>
+        <w:t xml:space="preserve"> to formal/larger non-alliance work requires being on the roster, applied for separately:</w:t>
       </w:r>
     </w:p>
     <w:p>
@@ -891,6 +1004,53 @@
       </w:r>
       <w:r>
         <w:t xml:space="preserve"> non-prequalified firms can still receive small direct awards (under ~$25k); and Bonfire is not the sole portal — it is BC Bid + Bonfire together, with the BC Bid NOI giving the application/submission details.</w:t>
+      </w:r>
+    </w:p>
+    <w:p>
+      <w:pPr>
+        <w:pStyle w:val="Compact"/>
+        <w:numPr>
+          <w:ilvl w:val="0"/>
+          <w:numId w:val="4"/>
+        </w:numPr>
+      </w:pPr>
+      <w:r>
+        <w:rPr>
+          <w:b/>
+          <w:bCs/>
+        </w:rPr>
+        <w:t>Don’t be thrown by the Fraser Health branding.</w:t>
+      </w:r>
+      <w:r>
+        <w:t xml:space="preserve"> The </w:t>
+      </w:r>
+      <w:r>
+        <w:rPr>
+          <w:rStyle w:val="VerbatimChar"/>
+        </w:rPr>
+        <w:t>fraserhealth.bonfirehub.ca</w:t>
+      </w:r>
+      <w:r>
+        <w:t xml:space="preserve"> portal and the </w:t>
+      </w:r>
+      <w:r>
+        <w:rPr>
+          <w:rStyle w:val="VerbatimChar"/>
+        </w:rPr>
+        <w:t>FMP@fraserhealth.ca</w:t>
+      </w:r>
+      <w:r>
+        <w:t xml:space="preserve"> contact are the </w:t>
+      </w:r>
+      <w:r>
+        <w:rPr>
+          <w:i/>
+          <w:iCs/>
+        </w:rPr>
+        <w:t>shared</w:t>
+      </w:r>
+      <w:r>
+        <w:t xml:space="preserve"> LMFM desk hosted by Fraser Health on behalf of all four authorities — applying here is applying for VCH work (see §1 callout). There is no VCH-only portal to find.</w:t>
       </w:r>
     </w:p>
     <w:p>
@@ -1116,14 +1276,7 @@
               <w:rPr>
                 <w:sz w:val="19"/>
               </w:rPr>
-              <w:t xml:space="preserve">Marquee acute-care </w:t>
-            </w:r>
-            <w:r>
-              <w:rPr>
-                <w:sz w:val="19"/>
-              </w:rPr>
-              <w:lastRenderedPageBreak/>
-              <w:t>towers (Richmond Yurkovich, VGH Campus, Lions Gate)</w:t>
+              <w:t>Marquee acute-care towers (Richmond Yurkovich, VGH Campus, Lions Gate)</w:t>
             </w:r>
           </w:p>
         </w:tc>
@@ -1142,15 +1295,7 @@
               <w:rPr>
                 <w:sz w:val="19"/>
               </w:rPr>
-              <w:lastRenderedPageBreak/>
-              <w:t xml:space="preserve">Infrastructure BC </w:t>
-            </w:r>
-            <w:r>
-              <w:rPr>
-                <w:sz w:val="19"/>
-              </w:rPr>
-              <w:lastRenderedPageBreak/>
-              <w:t>competitive-alliance / Single-TOC</w:t>
+              <w:t>Infrastructure BC competitive-alliance / Single-TOC</w:t>
             </w:r>
           </w:p>
         </w:tc>
@@ -1169,15 +1314,7 @@
               <w:rPr>
                 <w:sz w:val="19"/>
               </w:rPr>
-              <w:lastRenderedPageBreak/>
-              <w:t xml:space="preserve">Teaming with the </w:t>
-            </w:r>
-            <w:r>
-              <w:rPr>
-                <w:sz w:val="19"/>
-              </w:rPr>
-              <w:lastRenderedPageBreak/>
-              <w:t>architect / design-builder (HDR, Kasian, Graham) — structural is a sub on the winning team</w:t>
+              <w:t>Teaming with the architect / design-builder (HDR, Kasian, Graham) — structural is a sub on the winning team</w:t>
             </w:r>
           </w:p>
         </w:tc>
@@ -1196,15 +1333,7 @@
               <w:rPr>
                 <w:sz w:val="19"/>
               </w:rPr>
-              <w:lastRenderedPageBreak/>
-              <w:t xml:space="preserve">Already the VCH </w:t>
-            </w:r>
-            <w:r>
-              <w:rPr>
-                <w:sz w:val="19"/>
-              </w:rPr>
-              <w:lastRenderedPageBreak/>
-              <w:t>dossier strategy; roster does NOT apply</w:t>
+              <w:t>Already the VCH dossier strategy; roster does NOT apply</w:t>
             </w:r>
           </w:p>
         </w:tc>
@@ -1218,7 +1347,6 @@
       <w:bookmarkStart w:id="6" w:name="X891419cbfa574f1dfdad4d887bed2faf46b1c8c"/>
       <w:bookmarkEnd w:id="5"/>
       <w:r>
-        <w:lastRenderedPageBreak/>
         <w:t>4. Why the list is irrelevant for the marquee towers</w:t>
       </w:r>
     </w:p>
@@ -1265,6 +1393,7 @@
           <w:b/>
           <w:bCs/>
         </w:rPr>
+        <w:lastRenderedPageBreak/>
         <w:t>Care type:</w:t>
       </w:r>
       <w:r>
@@ -1454,14 +1583,7 @@
               <w:rPr>
                 <w:sz w:val="19"/>
               </w:rPr>
-              <w:t xml:space="preserve">Bush, Bohlman &amp; Partners </w:t>
-            </w:r>
-            <w:r>
-              <w:rPr>
-                <w:sz w:val="19"/>
-              </w:rPr>
-              <w:lastRenderedPageBreak/>
-              <w:t>LLP</w:t>
+              <w:t>Bush, Bohlman &amp; Partners LLP</w:t>
             </w:r>
           </w:p>
         </w:tc>
@@ -1480,7 +1602,6 @@
               <w:rPr>
                 <w:sz w:val="19"/>
               </w:rPr>
-              <w:lastRenderedPageBreak/>
               <w:t>Acute, all bands incl. &gt;$5M</w:t>
             </w:r>
           </w:p>
@@ -2293,6 +2414,7 @@
       <w:bookmarkStart w:id="10" w:name="key-sources-primary-unless-noted"/>
       <w:bookmarkEnd w:id="9"/>
       <w:r>
+        <w:lastRenderedPageBreak/>
         <w:t>8. Key sources (primary unless noted)</w:t>
       </w:r>
     </w:p>
@@ -2348,7 +2470,6 @@
         </w:numPr>
       </w:pPr>
       <w:r>
-        <w:lastRenderedPageBreak/>
         <w:t>RFPQ24-PE Request for Pre-Qualification for Professional Engineers (prior cycle; EGBC licensure requirement; Structural discipline)</w:t>
       </w:r>
     </w:p>
@@ -2419,7 +2540,7 @@
   <w:abstractNum w:abstractNumId="0" w15:restartNumberingAfterBreak="0">
     <w:nsid w:val="0000A990"/>
     <w:multiLevelType w:val="multilevel"/>
-    <w:tmpl w:val="0EFC1C6A"/>
+    <w:tmpl w:val="9670F238"/>
     <w:lvl w:ilvl="0">
       <w:numFmt w:val="bullet"/>
       <w:lvlText w:val=" "/>
@@ -2496,7 +2617,7 @@
   <w:abstractNum w:abstractNumId="1" w15:restartNumberingAfterBreak="0">
     <w:nsid w:val="0000A991"/>
     <w:multiLevelType w:val="multilevel"/>
-    <w:tmpl w:val="468CF474"/>
+    <w:tmpl w:val="E864D372"/>
     <w:lvl w:ilvl="0">
       <w:numFmt w:val="bullet"/>
       <w:lvlText w:val=""/>
@@ -2597,25 +2718,25 @@
       </w:rPr>
     </w:lvl>
   </w:abstractNum>
-  <w:num w:numId="1" w16cid:durableId="580869651">
+  <w:num w:numId="1" w16cid:durableId="1944803906">
     <w:abstractNumId w:val="0"/>
   </w:num>
-  <w:num w:numId="2" w16cid:durableId="2054189698">
+  <w:num w:numId="2" w16cid:durableId="1957132431">
     <w:abstractNumId w:val="1"/>
   </w:num>
-  <w:num w:numId="3" w16cid:durableId="2058821918">
+  <w:num w:numId="3" w16cid:durableId="645429365">
     <w:abstractNumId w:val="1"/>
   </w:num>
-  <w:num w:numId="4" w16cid:durableId="448866033">
+  <w:num w:numId="4" w16cid:durableId="1306541282">
     <w:abstractNumId w:val="1"/>
   </w:num>
-  <w:num w:numId="5" w16cid:durableId="335613933">
+  <w:num w:numId="5" w16cid:durableId="1085810028">
     <w:abstractNumId w:val="1"/>
   </w:num>
-  <w:num w:numId="6" w16cid:durableId="1086028996">
+  <w:num w:numId="6" w16cid:durableId="199898959">
     <w:abstractNumId w:val="1"/>
   </w:num>
-  <w:num w:numId="7" w16cid:durableId="410204441">
+  <w:num w:numId="7" w16cid:durableId="428164745">
     <w:abstractNumId w:val="1"/>
   </w:num>
 </w:numbering>
@@ -3850,7 +3971,7 @@
     <w:name w:val="Grid Table 4"/>
     <w:basedOn w:val="TableNormal"/>
     <w:uiPriority w:val="49"/>
-    <w:rsid w:val="00BD13BC"/>
+    <w:rsid w:val="00F6017A"/>
     <w:pPr>
       <w:spacing w:after="0"/>
     </w:pPr>

</xml_diff>